<commit_message>
feat(contracts): strictly enforce fixed Word docx template population mode, disable LLM contract text generation, and add template verification
</commit_message>
<xml_diff>
--- a/construction_maintenance/templates/docx_templates/2026_labor_contract_no_social_security.docx
+++ b/construction_maintenance/templates/docx_templates/2026_labor_contract_no_social_security.docx
@@ -28,43 +28,7 @@
         </w:rPr>
       </w:pPr>
       <w:r>
-        <w:rPr>
-          <w:rFonts w:hint="eastAsia"/>
-        </w:rPr>
-        <w:t xml:space="preserve">                               </w:t>
-      </w:r>
-      <w:r>
-        <w:rPr>
-          <w:rFonts w:hint="eastAsia"/>
-          <w:sz w:val="24"/>
-          <w:szCs w:val="24"/>
-        </w:rPr>
-        <w:t>合同编号</w:t>
-      </w:r>
-      <w:r>
-        <w:rPr>
-          <w:rFonts w:hint="eastAsia"/>
-          <w:sz w:val="24"/>
-          <w:szCs w:val="24"/>
-        </w:rPr>
-        <w:t>:</w:t>
-      </w:r>
-      <w:r>
-        <w:rPr>
-          <w:rFonts w:hint="eastAsia"/>
-          <w:sz w:val="24"/>
-          <w:szCs w:val="24"/>
-        </w:rPr>
-        <w:t xml:space="preserve"> </w:t>
-      </w:r>
-      <w:r>
-        <w:rPr>
-          <w:rFonts w:hint="eastAsia"/>
-          <w:sz w:val="24"/>
-          <w:szCs w:val="24"/>
-          <w:u w:val="single"/>
-        </w:rPr>
-        <w:t xml:space="preserve">               </w:t>
+        <w:t xml:space="preserve">                                       合同编号: {{contract_no}}</w:t>
       </w:r>
     </w:p>
     <w:p>
@@ -176,53 +140,20 @@
         </w:rPr>
       </w:pPr>
       <w:r>
-        <w:rPr>
-          <w:rFonts w:hint="eastAsia"/>
-          <w:sz w:val="28"/>
-          <w:szCs w:val="28"/>
-        </w:rPr>
-        <w:t>甲方</w:t>
-      </w:r>
-      <w:r>
-        <w:rPr>
-          <w:rFonts w:hint="eastAsia"/>
-          <w:sz w:val="28"/>
-          <w:szCs w:val="28"/>
-        </w:rPr>
-        <w:t xml:space="preserve"> (</w:t>
-      </w:r>
-      <w:r>
-        <w:rPr>
-          <w:rFonts w:hint="eastAsia"/>
-          <w:sz w:val="28"/>
-          <w:szCs w:val="28"/>
-        </w:rPr>
-        <w:t>用人单位</w:t>
-      </w:r>
-      <w:r>
-        <w:rPr>
-          <w:rFonts w:hint="eastAsia"/>
-          <w:sz w:val="28"/>
-          <w:szCs w:val="28"/>
-        </w:rPr>
-        <w:t>)</w:t>
-      </w:r>
-      <w:r>
-        <w:rPr>
-          <w:rFonts w:hint="eastAsia"/>
-          <w:sz w:val="28"/>
-          <w:szCs w:val="28"/>
-        </w:rPr>
-        <w:t>：</w:t>
-      </w:r>
-      <w:r>
-        <w:rPr>
-          <w:rFonts w:hint="eastAsia"/>
+        <w:t>甲方 (用人单位)： {{employer_name}}</w:t>
+      </w:r>
+    </w:p>
+    <w:p>
+      <w:pPr>
+        <w:ind w:firstLineChars="200" w:firstLine="560"/>
+        <w:rPr>
           <w:sz w:val="28"/>
           <w:szCs w:val="28"/>
           <w:u w:val="single"/>
         </w:rPr>
-        <w:t xml:space="preserve">                                 </w:t>
+      </w:pPr>
+      <w:r>
+        <w:t>乙方 (劳动者)  ： {{employee_name}}</w:t>
       </w:r>
     </w:p>
     <w:p>
@@ -231,259 +162,10 @@
         <w:rPr>
           <w:sz w:val="28"/>
           <w:szCs w:val="28"/>
-          <w:u w:val="single"/>
-        </w:rPr>
-      </w:pPr>
-      <w:r>
-        <w:rPr>
-          <w:rFonts w:hint="eastAsia"/>
-          <w:sz w:val="28"/>
-          <w:szCs w:val="28"/>
-        </w:rPr>
-        <w:t>乙方</w:t>
-      </w:r>
-      <w:r>
-        <w:rPr>
-          <w:rFonts w:hint="eastAsia"/>
-          <w:sz w:val="28"/>
-          <w:szCs w:val="28"/>
-        </w:rPr>
-        <w:t xml:space="preserve"> (</w:t>
-      </w:r>
-      <w:r>
-        <w:rPr>
-          <w:rFonts w:hint="eastAsia"/>
-          <w:sz w:val="28"/>
-          <w:szCs w:val="28"/>
-        </w:rPr>
-        <w:t>劳动者</w:t>
-      </w:r>
-      <w:r>
-        <w:rPr>
-          <w:rFonts w:hint="eastAsia"/>
-          <w:sz w:val="28"/>
-          <w:szCs w:val="28"/>
-        </w:rPr>
-        <w:t>)</w:t>
-      </w:r>
-      <w:r>
-        <w:rPr>
-          <w:rFonts w:hint="eastAsia"/>
-          <w:sz w:val="28"/>
-          <w:szCs w:val="28"/>
-        </w:rPr>
-        <w:t xml:space="preserve">  </w:t>
-      </w:r>
-      <w:r>
-        <w:rPr>
-          <w:rFonts w:hint="eastAsia"/>
-          <w:sz w:val="28"/>
-          <w:szCs w:val="28"/>
-        </w:rPr>
-        <w:t>：</w:t>
-      </w:r>
-      <w:r>
-        <w:rPr>
-          <w:rFonts w:hint="eastAsia"/>
-          <w:sz w:val="28"/>
-          <w:szCs w:val="28"/>
-          <w:u w:val="single"/>
-        </w:rPr>
-        <w:t xml:space="preserve">                                 </w:t>
-      </w:r>
-    </w:p>
-    <w:p>
-      <w:pPr>
-        <w:ind w:firstLineChars="200" w:firstLine="560"/>
-        <w:rPr>
-          <w:sz w:val="28"/>
-          <w:szCs w:val="28"/>
-        </w:rPr>
-      </w:pPr>
-      <w:r>
-        <w:rPr>
-          <w:rFonts w:hint="eastAsia"/>
-          <w:sz w:val="28"/>
-          <w:szCs w:val="28"/>
-        </w:rPr>
-        <w:t>签</w:t>
-      </w:r>
-      <w:r>
-        <w:rPr>
-          <w:rFonts w:hint="eastAsia"/>
-          <w:sz w:val="28"/>
-          <w:szCs w:val="28"/>
-        </w:rPr>
-        <w:t xml:space="preserve"> </w:t>
-      </w:r>
-      <w:r>
-        <w:rPr>
-          <w:rFonts w:hint="eastAsia"/>
-          <w:sz w:val="28"/>
-          <w:szCs w:val="28"/>
-        </w:rPr>
-        <w:t>订</w:t>
-      </w:r>
-      <w:r>
-        <w:rPr>
-          <w:rFonts w:hint="eastAsia"/>
-          <w:sz w:val="28"/>
-          <w:szCs w:val="28"/>
-        </w:rPr>
-        <w:t xml:space="preserve"> </w:t>
-      </w:r>
-      <w:r>
-        <w:rPr>
-          <w:rFonts w:hint="eastAsia"/>
-          <w:sz w:val="28"/>
-          <w:szCs w:val="28"/>
-        </w:rPr>
-        <w:t>时</w:t>
-      </w:r>
-      <w:r>
-        <w:rPr>
-          <w:rFonts w:hint="eastAsia"/>
-          <w:sz w:val="28"/>
-          <w:szCs w:val="28"/>
-        </w:rPr>
-        <w:t xml:space="preserve"> </w:t>
-      </w:r>
-      <w:r>
-        <w:rPr>
-          <w:rFonts w:hint="eastAsia"/>
-          <w:sz w:val="28"/>
-          <w:szCs w:val="28"/>
-        </w:rPr>
-        <w:t>间</w:t>
-      </w:r>
-      <w:r>
-        <w:rPr>
-          <w:rFonts w:hint="eastAsia"/>
-          <w:sz w:val="28"/>
-          <w:szCs w:val="28"/>
-        </w:rPr>
-        <w:t xml:space="preserve">   </w:t>
-      </w:r>
-      <w:r>
-        <w:rPr>
-          <w:rFonts w:hint="eastAsia"/>
-          <w:sz w:val="28"/>
-          <w:szCs w:val="28"/>
-        </w:rPr>
-        <w:t>:</w:t>
-      </w:r>
-      <w:r>
-        <w:rPr>
-          <w:rFonts w:hint="eastAsia"/>
-          <w:sz w:val="28"/>
-          <w:szCs w:val="28"/>
-        </w:rPr>
-        <w:t xml:space="preserve"> </w:t>
-      </w:r>
-      <w:r>
-        <w:rPr>
-          <w:rFonts w:hint="eastAsia"/>
-          <w:sz w:val="28"/>
-          <w:szCs w:val="28"/>
-          <w:u w:val="single"/>
-        </w:rPr>
-        <w:t xml:space="preserve">        </w:t>
-      </w:r>
-      <w:r>
-        <w:rPr>
-          <w:rFonts w:hint="eastAsia"/>
-          <w:sz w:val="28"/>
-          <w:szCs w:val="28"/>
-          <w:u w:val="single"/>
-        </w:rPr>
-        <w:t xml:space="preserve"> </w:t>
-      </w:r>
-      <w:r>
-        <w:rPr>
-          <w:rFonts w:hint="eastAsia"/>
-          <w:sz w:val="28"/>
-          <w:szCs w:val="28"/>
-          <w:u w:val="single"/>
-        </w:rPr>
-        <w:t xml:space="preserve"> </w:t>
-      </w:r>
-      <w:r>
-        <w:rPr>
-          <w:rFonts w:hint="eastAsia"/>
-          <w:sz w:val="28"/>
-          <w:szCs w:val="28"/>
-        </w:rPr>
-        <w:t>年</w:t>
-      </w:r>
-      <w:r>
-        <w:rPr>
-          <w:rFonts w:hint="eastAsia"/>
-          <w:sz w:val="28"/>
-          <w:szCs w:val="28"/>
-          <w:u w:val="single"/>
-        </w:rPr>
-        <w:t xml:space="preserve">    </w:t>
-      </w:r>
-      <w:r>
-        <w:rPr>
-          <w:rFonts w:hint="eastAsia"/>
-          <w:sz w:val="28"/>
-          <w:szCs w:val="28"/>
-          <w:u w:val="single"/>
-        </w:rPr>
-        <w:t xml:space="preserve"> </w:t>
-      </w:r>
-      <w:r>
-        <w:rPr>
-          <w:rFonts w:hint="eastAsia"/>
-          <w:sz w:val="28"/>
-          <w:szCs w:val="28"/>
-          <w:u w:val="single"/>
-        </w:rPr>
-        <w:t xml:space="preserve">    </w:t>
-      </w:r>
-      <w:r>
-        <w:rPr>
-          <w:rFonts w:hint="eastAsia"/>
-          <w:sz w:val="28"/>
-          <w:szCs w:val="28"/>
-        </w:rPr>
-        <w:t>月</w:t>
-      </w:r>
-      <w:r>
-        <w:rPr>
-          <w:rFonts w:hint="eastAsia"/>
-          <w:sz w:val="28"/>
-          <w:szCs w:val="28"/>
-          <w:u w:val="single"/>
-        </w:rPr>
-        <w:t xml:space="preserve">       </w:t>
-      </w:r>
-      <w:r>
-        <w:rPr>
-          <w:rFonts w:hint="eastAsia"/>
-          <w:sz w:val="28"/>
-          <w:szCs w:val="28"/>
-          <w:u w:val="single"/>
-        </w:rPr>
-        <w:t xml:space="preserve"> </w:t>
-      </w:r>
-      <w:r>
-        <w:rPr>
-          <w:rFonts w:hint="eastAsia"/>
-          <w:sz w:val="28"/>
-          <w:szCs w:val="28"/>
-          <w:u w:val="single"/>
-        </w:rPr>
-        <w:t xml:space="preserve"> </w:t>
-      </w:r>
-      <w:r>
-        <w:rPr>
-          <w:rFonts w:hint="eastAsia"/>
-          <w:sz w:val="28"/>
-          <w:szCs w:val="28"/>
-        </w:rPr>
-        <w:t>日</w:t>
+        </w:rPr>
+      </w:pPr>
+      <w:r>
+        <w:t>签 订 时 间   : {{signing_date}}</w:t>
       </w:r>
     </w:p>
     <w:p>
@@ -580,12 +262,169 @@
         </w:rPr>
       </w:pPr>
       <w:r>
-        <w:rPr>
-          <w:rFonts w:hint="eastAsia"/>
-          <w:sz w:val="24"/>
-          <w:szCs w:val="24"/>
-        </w:rPr>
-        <w:t>单位名称</w:t>
+        <w:t>单位名称: {{employer_name}}</w:t>
+      </w:r>
+    </w:p>
+    <w:p>
+      <w:pPr>
+        <w:spacing w:line="360" w:lineRule="auto"/>
+        <w:ind w:firstLineChars="200" w:firstLine="480"/>
+        <w:rPr>
+          <w:sz w:val="24"/>
+          <w:szCs w:val="24"/>
+          <w:u w:val="single"/>
+        </w:rPr>
+      </w:pPr>
+      <w:r>
+        <w:t>地址: {{employer_address}}</w:t>
+      </w:r>
+    </w:p>
+    <w:p>
+      <w:pPr>
+        <w:spacing w:line="360" w:lineRule="auto"/>
+        <w:ind w:firstLineChars="200" w:firstLine="480"/>
+        <w:rPr>
+          <w:sz w:val="24"/>
+          <w:szCs w:val="24"/>
+        </w:rPr>
+      </w:pPr>
+    </w:p>
+    <w:p>
+      <w:pPr>
+        <w:spacing w:line="360" w:lineRule="auto"/>
+        <w:ind w:firstLineChars="200" w:firstLine="480"/>
+        <w:rPr>
+          <w:sz w:val="24"/>
+          <w:szCs w:val="24"/>
+        </w:rPr>
+      </w:pPr>
+      <w:r>
+        <w:rPr>
+          <w:rFonts w:hint="eastAsia"/>
+          <w:sz w:val="24"/>
+          <w:szCs w:val="24"/>
+        </w:rPr>
+        <w:t>劳务方</w:t>
+      </w:r>
+      <w:r>
+        <w:rPr>
+          <w:rFonts w:hint="eastAsia"/>
+          <w:sz w:val="24"/>
+          <w:szCs w:val="24"/>
+        </w:rPr>
+        <w:t xml:space="preserve">( </w:t>
+      </w:r>
+      <w:r>
+        <w:rPr>
+          <w:rFonts w:hint="eastAsia"/>
+          <w:sz w:val="24"/>
+          <w:szCs w:val="24"/>
+        </w:rPr>
+        <w:t>乙方</w:t>
+      </w:r>
+      <w:r>
+        <w:rPr>
+          <w:rFonts w:hint="eastAsia"/>
+          <w:sz w:val="24"/>
+          <w:szCs w:val="24"/>
+        </w:rPr>
+        <w:t xml:space="preserve"> )</w:t>
+      </w:r>
+    </w:p>
+    <w:p>
+      <w:pPr>
+        <w:spacing w:line="360" w:lineRule="auto"/>
+        <w:ind w:firstLineChars="200" w:firstLine="480"/>
+        <w:rPr>
+          <w:sz w:val="24"/>
+          <w:szCs w:val="24"/>
+          <w:u w:val="single"/>
+        </w:rPr>
+      </w:pPr>
+      <w:r>
+        <w:t>姓名: {{employee_name}}                          联系电话: {{employee_phone}}</w:t>
+      </w:r>
+    </w:p>
+    <w:p>
+      <w:pPr>
+        <w:spacing w:line="360" w:lineRule="auto"/>
+        <w:ind w:firstLineChars="200" w:firstLine="480"/>
+        <w:rPr>
+          <w:sz w:val="24"/>
+          <w:szCs w:val="24"/>
+          <w:u w:val="single"/>
+        </w:rPr>
+      </w:pPr>
+      <w:r>
+        <w:t>身份证号码: {{employee_id_number}}                    紧急联系人电话: {{employee_phone}}</w:t>
+      </w:r>
+    </w:p>
+    <w:p>
+      <w:pPr>
+        <w:spacing w:line="360" w:lineRule="auto"/>
+        <w:ind w:firstLineChars="200" w:firstLine="480"/>
+        <w:rPr>
+          <w:sz w:val="24"/>
+          <w:szCs w:val="24"/>
+          <w:u w:val="single"/>
+        </w:rPr>
+      </w:pPr>
+      <w:r>
+        <w:t>户籍所在地: {{employee_address}}</w:t>
+      </w:r>
+    </w:p>
+    <w:p>
+      <w:pPr>
+        <w:spacing w:line="360" w:lineRule="auto"/>
+        <w:ind w:firstLineChars="200" w:firstLine="480"/>
+        <w:rPr>
+          <w:sz w:val="24"/>
+          <w:szCs w:val="24"/>
+          <w:u w:val="single"/>
+        </w:rPr>
+      </w:pPr>
+      <w:r>
+        <w:t>住址: {{employee_address}}</w:t>
+      </w:r>
+    </w:p>
+    <w:p>
+      <w:pPr>
+        <w:spacing w:line="360" w:lineRule="auto"/>
+        <w:ind w:firstLineChars="200" w:firstLine="480"/>
+        <w:rPr>
+          <w:sz w:val="24"/>
+          <w:szCs w:val="24"/>
+        </w:rPr>
+      </w:pPr>
+    </w:p>
+    <w:p>
+      <w:pPr>
+        <w:spacing w:line="360" w:lineRule="auto"/>
+        <w:ind w:firstLineChars="200" w:firstLine="480"/>
+        <w:rPr>
+          <w:sz w:val="24"/>
+          <w:szCs w:val="24"/>
+        </w:rPr>
+      </w:pPr>
+      <w:r>
+        <w:t>鉴于甲方业务发展需要，雇佣乙方为 {{job_position}} 提供劳务服务，经双方协商订立正式《劳务雇佣合同书》如下:</w:t>
+      </w:r>
+    </w:p>
+    <w:p>
+      <w:pPr>
+        <w:spacing w:line="360" w:lineRule="auto"/>
+        <w:rPr>
+          <w:sz w:val="24"/>
+          <w:szCs w:val="24"/>
+        </w:rPr>
+      </w:pPr>
+      <w:r>
+        <w:rPr>
+          <w:rFonts w:hint="eastAsia"/>
+          <w:sz w:val="24"/>
+          <w:szCs w:val="24"/>
+        </w:rPr>
+        <w:t>提供劳务服务，经双方协商订立正式《劳务雇佣合同书》如下</w:t>
       </w:r>
       <w:r>
         <w:rPr>
@@ -595,6 +434,57 @@
         </w:rPr>
         <w:t>:</w:t>
       </w:r>
+    </w:p>
+    <w:p>
+      <w:pPr>
+        <w:spacing w:line="360" w:lineRule="auto"/>
+        <w:ind w:firstLineChars="200" w:firstLine="482"/>
+        <w:rPr>
+          <w:b/>
+          <w:sz w:val="24"/>
+          <w:szCs w:val="24"/>
+        </w:rPr>
+      </w:pPr>
+      <w:r>
+        <w:rPr>
+          <w:rFonts w:hint="eastAsia"/>
+          <w:b/>
+          <w:sz w:val="24"/>
+          <w:szCs w:val="24"/>
+        </w:rPr>
+        <w:t>一、合同期限</w:t>
+      </w:r>
+    </w:p>
+    <w:p>
+      <w:pPr>
+        <w:spacing w:line="360" w:lineRule="auto"/>
+        <w:ind w:firstLineChars="200" w:firstLine="480"/>
+        <w:rPr>
+          <w:sz w:val="24"/>
+          <w:szCs w:val="24"/>
+        </w:rPr>
+      </w:pPr>
+      <w:r>
+        <w:t>本合同期限自 {{contract_start_date}} 起至 {{contract_end_date}} 止:</w:t>
+      </w:r>
+    </w:p>
+    <w:p>
+      <w:pPr>
+        <w:spacing w:line="360" w:lineRule="auto"/>
+        <w:ind w:firstLineChars="200" w:firstLine="480"/>
+        <w:rPr>
+          <w:sz w:val="24"/>
+          <w:szCs w:val="24"/>
+        </w:rPr>
+      </w:pPr>
+      <w:r>
+        <w:rPr>
+          <w:rFonts w:hint="eastAsia"/>
+          <w:sz w:val="24"/>
+          <w:szCs w:val="24"/>
+        </w:rPr>
+        <w:t>如双方需要，可在合同期满前</w:t>
+      </w:r>
       <w:r>
         <w:rPr>
           <w:rFonts w:hint="eastAsia"/>
@@ -602,7 +492,61 @@
           <w:szCs w:val="24"/>
           <w:u w:val="single"/>
         </w:rPr>
-        <w:t xml:space="preserve">                                                       </w:t>
+        <w:t xml:space="preserve">      </w:t>
+      </w:r>
+      <w:proofErr w:type="gramStart"/>
+      <w:r>
+        <w:rPr>
+          <w:rFonts w:hint="eastAsia"/>
+          <w:sz w:val="24"/>
+          <w:szCs w:val="24"/>
+        </w:rPr>
+        <w:t>个</w:t>
+      </w:r>
+      <w:proofErr w:type="gramEnd"/>
+      <w:r>
+        <w:rPr>
+          <w:rFonts w:hint="eastAsia"/>
+          <w:sz w:val="24"/>
+          <w:szCs w:val="24"/>
+        </w:rPr>
+        <w:t>月协商续签劳务雇佣合同。如合同期已满</w:t>
+      </w:r>
+      <w:r>
+        <w:rPr>
+          <w:rFonts w:hint="eastAsia"/>
+          <w:sz w:val="24"/>
+          <w:szCs w:val="24"/>
+        </w:rPr>
+        <w:t>，</w:t>
+      </w:r>
+      <w:r>
+        <w:rPr>
+          <w:rFonts w:hint="eastAsia"/>
+          <w:sz w:val="24"/>
+          <w:szCs w:val="24"/>
+        </w:rPr>
+        <w:t>双方不在续签合同，但乙方从事的有关工作尚未结束，则合同应顺延至有关业务结束</w:t>
+      </w:r>
+    </w:p>
+    <w:p>
+      <w:pPr>
+        <w:spacing w:line="360" w:lineRule="auto"/>
+        <w:ind w:firstLineChars="200" w:firstLine="482"/>
+        <w:rPr>
+          <w:b/>
+          <w:sz w:val="24"/>
+          <w:szCs w:val="24"/>
+        </w:rPr>
+      </w:pPr>
+      <w:r>
+        <w:rPr>
+          <w:rFonts w:hint="eastAsia"/>
+          <w:b/>
+          <w:sz w:val="24"/>
+          <w:szCs w:val="24"/>
+        </w:rPr>
+        <w:t>二、劳务内容</w:t>
       </w:r>
     </w:p>
     <w:p>
@@ -616,652 +560,7 @@
         </w:rPr>
       </w:pPr>
       <w:r>
-        <w:rPr>
-          <w:rFonts w:hint="eastAsia"/>
-          <w:sz w:val="24"/>
-          <w:szCs w:val="24"/>
-        </w:rPr>
-        <w:t>地址</w:t>
-      </w:r>
-      <w:r>
-        <w:rPr>
-          <w:rFonts w:hint="eastAsia"/>
-          <w:sz w:val="24"/>
-          <w:szCs w:val="24"/>
-        </w:rPr>
-        <w:t>:</w:t>
-      </w:r>
-      <w:r>
-        <w:rPr>
-          <w:rFonts w:hint="eastAsia"/>
-          <w:sz w:val="24"/>
-          <w:szCs w:val="24"/>
-          <w:u w:val="single"/>
-        </w:rPr>
-        <w:t xml:space="preserve">                                                           </w:t>
-      </w:r>
-    </w:p>
-    <w:p>
-      <w:pPr>
-        <w:spacing w:line="360" w:lineRule="auto"/>
-        <w:ind w:firstLineChars="200" w:firstLine="480"/>
-        <w:rPr>
-          <w:sz w:val="24"/>
-          <w:szCs w:val="24"/>
-        </w:rPr>
-      </w:pPr>
-    </w:p>
-    <w:p>
-      <w:pPr>
-        <w:spacing w:line="360" w:lineRule="auto"/>
-        <w:ind w:firstLineChars="200" w:firstLine="480"/>
-        <w:rPr>
-          <w:sz w:val="24"/>
-          <w:szCs w:val="24"/>
-        </w:rPr>
-      </w:pPr>
-      <w:r>
-        <w:rPr>
-          <w:rFonts w:hint="eastAsia"/>
-          <w:sz w:val="24"/>
-          <w:szCs w:val="24"/>
-        </w:rPr>
-        <w:t>劳务方</w:t>
-      </w:r>
-      <w:r>
-        <w:rPr>
-          <w:rFonts w:hint="eastAsia"/>
-          <w:sz w:val="24"/>
-          <w:szCs w:val="24"/>
-        </w:rPr>
-        <w:t xml:space="preserve">( </w:t>
-      </w:r>
-      <w:r>
-        <w:rPr>
-          <w:rFonts w:hint="eastAsia"/>
-          <w:sz w:val="24"/>
-          <w:szCs w:val="24"/>
-        </w:rPr>
-        <w:t>乙方</w:t>
-      </w:r>
-      <w:r>
-        <w:rPr>
-          <w:rFonts w:hint="eastAsia"/>
-          <w:sz w:val="24"/>
-          <w:szCs w:val="24"/>
-        </w:rPr>
-        <w:t xml:space="preserve"> )</w:t>
-      </w:r>
-    </w:p>
-    <w:p>
-      <w:pPr>
-        <w:spacing w:line="360" w:lineRule="auto"/>
-        <w:ind w:firstLineChars="200" w:firstLine="480"/>
-        <w:rPr>
-          <w:sz w:val="24"/>
-          <w:szCs w:val="24"/>
-          <w:u w:val="single"/>
-        </w:rPr>
-      </w:pPr>
-      <w:r>
-        <w:rPr>
-          <w:rFonts w:hint="eastAsia"/>
-          <w:sz w:val="24"/>
-          <w:szCs w:val="24"/>
-        </w:rPr>
-        <w:t>姓名</w:t>
-      </w:r>
-      <w:r>
-        <w:rPr>
-          <w:rFonts w:hint="eastAsia"/>
-          <w:sz w:val="24"/>
-          <w:szCs w:val="24"/>
-        </w:rPr>
-        <w:t>:</w:t>
-      </w:r>
-      <w:r>
-        <w:rPr>
-          <w:rFonts w:hint="eastAsia"/>
-          <w:sz w:val="24"/>
-          <w:szCs w:val="24"/>
-        </w:rPr>
-        <w:t xml:space="preserve"> </w:t>
-      </w:r>
-      <w:r>
-        <w:rPr>
-          <w:rFonts w:hint="eastAsia"/>
-          <w:sz w:val="24"/>
-          <w:szCs w:val="24"/>
-          <w:u w:val="single"/>
-        </w:rPr>
-        <w:t xml:space="preserve">                         </w:t>
-      </w:r>
-      <w:r>
-        <w:rPr>
-          <w:rFonts w:hint="eastAsia"/>
-          <w:sz w:val="24"/>
-          <w:szCs w:val="24"/>
-        </w:rPr>
-        <w:t>联系电话</w:t>
-      </w:r>
-      <w:r>
-        <w:rPr>
-          <w:rFonts w:hint="eastAsia"/>
-          <w:sz w:val="24"/>
-          <w:szCs w:val="24"/>
-        </w:rPr>
-        <w:t>:</w:t>
-      </w:r>
-      <w:r>
-        <w:rPr>
-          <w:rFonts w:hint="eastAsia"/>
-          <w:sz w:val="24"/>
-          <w:szCs w:val="24"/>
-          <w:u w:val="single"/>
-        </w:rPr>
-        <w:t xml:space="preserve">                        </w:t>
-      </w:r>
-    </w:p>
-    <w:p>
-      <w:pPr>
-        <w:spacing w:line="360" w:lineRule="auto"/>
-        <w:ind w:firstLineChars="200" w:firstLine="480"/>
-        <w:rPr>
-          <w:sz w:val="24"/>
-          <w:szCs w:val="24"/>
-          <w:u w:val="single"/>
-        </w:rPr>
-      </w:pPr>
-      <w:r>
-        <w:rPr>
-          <w:rFonts w:hint="eastAsia"/>
-          <w:sz w:val="24"/>
-          <w:szCs w:val="24"/>
-        </w:rPr>
-        <w:t>身份证号码</w:t>
-      </w:r>
-      <w:r>
-        <w:rPr>
-          <w:rFonts w:hint="eastAsia"/>
-          <w:sz w:val="24"/>
-          <w:szCs w:val="24"/>
-        </w:rPr>
-        <w:t xml:space="preserve">: </w:t>
-      </w:r>
-      <w:r>
-        <w:rPr>
-          <w:rFonts w:hint="eastAsia"/>
-          <w:sz w:val="24"/>
-          <w:szCs w:val="24"/>
-          <w:u w:val="single"/>
-        </w:rPr>
-        <w:t xml:space="preserve">                   </w:t>
-      </w:r>
-      <w:r>
-        <w:rPr>
-          <w:rFonts w:hint="eastAsia"/>
-          <w:sz w:val="24"/>
-          <w:szCs w:val="24"/>
-        </w:rPr>
-        <w:t>紧急联系人电话</w:t>
-      </w:r>
-      <w:r>
-        <w:rPr>
-          <w:rFonts w:hint="eastAsia"/>
-          <w:sz w:val="24"/>
-          <w:szCs w:val="24"/>
-        </w:rPr>
-        <w:t>:</w:t>
-      </w:r>
-      <w:r>
-        <w:rPr>
-          <w:rFonts w:hint="eastAsia"/>
-          <w:sz w:val="24"/>
-          <w:szCs w:val="24"/>
-          <w:u w:val="single"/>
-        </w:rPr>
-        <w:t xml:space="preserve">                  </w:t>
-      </w:r>
-    </w:p>
-    <w:p>
-      <w:pPr>
-        <w:spacing w:line="360" w:lineRule="auto"/>
-        <w:ind w:firstLineChars="200" w:firstLine="480"/>
-        <w:rPr>
-          <w:sz w:val="24"/>
-          <w:szCs w:val="24"/>
-          <w:u w:val="single"/>
-        </w:rPr>
-      </w:pPr>
-      <w:r>
-        <w:rPr>
-          <w:rFonts w:hint="eastAsia"/>
-          <w:sz w:val="24"/>
-          <w:szCs w:val="24"/>
-        </w:rPr>
-        <w:t>户籍所在地</w:t>
-      </w:r>
-      <w:r>
-        <w:rPr>
-          <w:rFonts w:hint="eastAsia"/>
-          <w:sz w:val="24"/>
-          <w:szCs w:val="24"/>
-        </w:rPr>
-        <w:t>:</w:t>
-      </w:r>
-      <w:r>
-        <w:rPr>
-          <w:rFonts w:hint="eastAsia"/>
-          <w:sz w:val="24"/>
-          <w:szCs w:val="24"/>
-          <w:u w:val="single"/>
-        </w:rPr>
-        <w:t xml:space="preserve">                                                     </w:t>
-      </w:r>
-    </w:p>
-    <w:p>
-      <w:pPr>
-        <w:spacing w:line="360" w:lineRule="auto"/>
-        <w:ind w:firstLineChars="200" w:firstLine="480"/>
-        <w:rPr>
-          <w:sz w:val="24"/>
-          <w:szCs w:val="24"/>
-          <w:u w:val="single"/>
-        </w:rPr>
-      </w:pPr>
-      <w:r>
-        <w:rPr>
-          <w:rFonts w:hint="eastAsia"/>
-          <w:sz w:val="24"/>
-          <w:szCs w:val="24"/>
-        </w:rPr>
-        <w:t>住址</w:t>
-      </w:r>
-      <w:r>
-        <w:rPr>
-          <w:rFonts w:hint="eastAsia"/>
-          <w:sz w:val="24"/>
-          <w:szCs w:val="24"/>
-        </w:rPr>
-        <w:t>:</w:t>
-      </w:r>
-      <w:r>
-        <w:rPr>
-          <w:rFonts w:hint="eastAsia"/>
-          <w:sz w:val="24"/>
-          <w:szCs w:val="24"/>
-          <w:u w:val="single"/>
-        </w:rPr>
-        <w:t xml:space="preserve">                                                           </w:t>
-      </w:r>
-    </w:p>
-    <w:p>
-      <w:pPr>
-        <w:spacing w:line="360" w:lineRule="auto"/>
-        <w:ind w:firstLineChars="200" w:firstLine="480"/>
-        <w:rPr>
-          <w:sz w:val="24"/>
-          <w:szCs w:val="24"/>
-        </w:rPr>
-      </w:pPr>
-    </w:p>
-    <w:p>
-      <w:pPr>
-        <w:spacing w:line="360" w:lineRule="auto"/>
-        <w:ind w:firstLineChars="200" w:firstLine="480"/>
-        <w:rPr>
-          <w:sz w:val="24"/>
-          <w:szCs w:val="24"/>
-        </w:rPr>
-      </w:pPr>
-      <w:r>
-        <w:rPr>
-          <w:rFonts w:hint="eastAsia"/>
-          <w:sz w:val="24"/>
-          <w:szCs w:val="24"/>
-        </w:rPr>
-        <w:t>鉴于甲方业务发展需要，雇佣乙方为</w:t>
-      </w:r>
-      <w:r>
-        <w:rPr>
-          <w:rFonts w:hint="eastAsia"/>
-          <w:sz w:val="24"/>
-          <w:szCs w:val="24"/>
-        </w:rPr>
-        <w:t xml:space="preserve">                        </w:t>
-      </w:r>
-      <w:r>
-        <w:rPr>
-          <w:rFonts w:hint="eastAsia"/>
-          <w:sz w:val="24"/>
-          <w:szCs w:val="24"/>
-        </w:rPr>
-        <w:t xml:space="preserve">       </w:t>
-      </w:r>
-    </w:p>
-    <w:p>
-      <w:pPr>
-        <w:spacing w:line="360" w:lineRule="auto"/>
-        <w:rPr>
-          <w:sz w:val="24"/>
-          <w:szCs w:val="24"/>
-        </w:rPr>
-      </w:pPr>
-      <w:r>
-        <w:rPr>
-          <w:rFonts w:hint="eastAsia"/>
-          <w:sz w:val="24"/>
-          <w:szCs w:val="24"/>
-        </w:rPr>
-        <w:t>提供劳务服务，经双方协商订立正式《劳务雇佣合同书》如下</w:t>
-      </w:r>
-      <w:r>
-        <w:rPr>
-          <w:rFonts w:hint="eastAsia"/>
-          <w:sz w:val="24"/>
-          <w:szCs w:val="24"/>
-        </w:rPr>
-        <w:t>:</w:t>
-      </w:r>
-    </w:p>
-    <w:p>
-      <w:pPr>
-        <w:spacing w:line="360" w:lineRule="auto"/>
-        <w:ind w:firstLineChars="200" w:firstLine="482"/>
-        <w:rPr>
-          <w:b/>
-          <w:sz w:val="24"/>
-          <w:szCs w:val="24"/>
-        </w:rPr>
-      </w:pPr>
-      <w:r>
-        <w:rPr>
-          <w:rFonts w:hint="eastAsia"/>
-          <w:b/>
-          <w:sz w:val="24"/>
-          <w:szCs w:val="24"/>
-        </w:rPr>
-        <w:t>一、合同期限</w:t>
-      </w:r>
-    </w:p>
-    <w:p>
-      <w:pPr>
-        <w:spacing w:line="360" w:lineRule="auto"/>
-        <w:ind w:firstLineChars="200" w:firstLine="480"/>
-        <w:rPr>
-          <w:sz w:val="24"/>
-          <w:szCs w:val="24"/>
-        </w:rPr>
-      </w:pPr>
-      <w:r>
-        <w:rPr>
-          <w:rFonts w:hint="eastAsia"/>
-          <w:sz w:val="24"/>
-          <w:szCs w:val="24"/>
-        </w:rPr>
-        <w:t>本合同期限自</w:t>
-      </w:r>
-      <w:r>
-        <w:rPr>
-          <w:rFonts w:hint="eastAsia"/>
-          <w:sz w:val="24"/>
-          <w:szCs w:val="24"/>
-        </w:rPr>
-        <w:t xml:space="preserve"> </w:t>
-      </w:r>
-      <w:r>
-        <w:rPr>
-          <w:rFonts w:hint="eastAsia"/>
-          <w:sz w:val="24"/>
-          <w:szCs w:val="24"/>
-          <w:u w:val="single"/>
-        </w:rPr>
-        <w:t xml:space="preserve">   </w:t>
-      </w:r>
-      <w:r>
-        <w:rPr>
-          <w:rFonts w:hint="eastAsia"/>
-          <w:sz w:val="24"/>
-          <w:szCs w:val="24"/>
-          <w:u w:val="single"/>
-        </w:rPr>
-        <w:t xml:space="preserve">  </w:t>
-      </w:r>
-      <w:r>
-        <w:rPr>
-          <w:rFonts w:hint="eastAsia"/>
-          <w:sz w:val="24"/>
-          <w:szCs w:val="24"/>
-        </w:rPr>
-        <w:t>年</w:t>
-      </w:r>
-      <w:r>
-        <w:rPr>
-          <w:rFonts w:hint="eastAsia"/>
-          <w:sz w:val="24"/>
-          <w:szCs w:val="24"/>
-          <w:u w:val="single"/>
-        </w:rPr>
-        <w:t xml:space="preserve">     </w:t>
-      </w:r>
-      <w:r>
-        <w:rPr>
-          <w:rFonts w:hint="eastAsia"/>
-          <w:sz w:val="24"/>
-          <w:szCs w:val="24"/>
-        </w:rPr>
-        <w:t>月</w:t>
-      </w:r>
-      <w:r>
-        <w:rPr>
-          <w:rFonts w:hint="eastAsia"/>
-          <w:sz w:val="24"/>
-          <w:szCs w:val="24"/>
-          <w:u w:val="single"/>
-        </w:rPr>
-        <w:t xml:space="preserve">     </w:t>
-      </w:r>
-      <w:r>
-        <w:rPr>
-          <w:rFonts w:hint="eastAsia"/>
-          <w:sz w:val="24"/>
-          <w:szCs w:val="24"/>
-        </w:rPr>
-        <w:t>日起至</w:t>
-      </w:r>
-      <w:r>
-        <w:rPr>
-          <w:rFonts w:hint="eastAsia"/>
-          <w:sz w:val="24"/>
-          <w:szCs w:val="24"/>
-          <w:u w:val="single"/>
-        </w:rPr>
-        <w:t xml:space="preserve">     </w:t>
-      </w:r>
-      <w:r>
-        <w:rPr>
-          <w:rFonts w:hint="eastAsia"/>
-          <w:sz w:val="24"/>
-          <w:szCs w:val="24"/>
-        </w:rPr>
-        <w:t>年</w:t>
-      </w:r>
-      <w:r>
-        <w:rPr>
-          <w:rFonts w:hint="eastAsia"/>
-          <w:sz w:val="24"/>
-          <w:szCs w:val="24"/>
-          <w:u w:val="single"/>
-        </w:rPr>
-        <w:t xml:space="preserve">    </w:t>
-      </w:r>
-      <w:r>
-        <w:rPr>
-          <w:rFonts w:hint="eastAsia"/>
-          <w:sz w:val="24"/>
-          <w:szCs w:val="24"/>
-        </w:rPr>
-        <w:t>月</w:t>
-      </w:r>
-      <w:r>
-        <w:rPr>
-          <w:rFonts w:hint="eastAsia"/>
-          <w:sz w:val="24"/>
-          <w:szCs w:val="24"/>
-          <w:u w:val="single"/>
-        </w:rPr>
-        <w:t xml:space="preserve"> </w:t>
-      </w:r>
-      <w:r>
-        <w:rPr>
-          <w:rFonts w:hint="eastAsia"/>
-          <w:sz w:val="24"/>
-          <w:szCs w:val="24"/>
-          <w:u w:val="single"/>
-        </w:rPr>
-        <w:t xml:space="preserve"> </w:t>
-      </w:r>
-      <w:r>
-        <w:rPr>
-          <w:rFonts w:hint="eastAsia"/>
-          <w:sz w:val="24"/>
-          <w:szCs w:val="24"/>
-          <w:u w:val="single"/>
-        </w:rPr>
-        <w:t xml:space="preserve">   </w:t>
-      </w:r>
-      <w:r>
-        <w:rPr>
-          <w:rFonts w:hint="eastAsia"/>
-          <w:sz w:val="24"/>
-          <w:szCs w:val="24"/>
-        </w:rPr>
-        <w:t>日止</w:t>
-      </w:r>
-      <w:r>
-        <w:rPr>
-          <w:rFonts w:hint="eastAsia"/>
-          <w:sz w:val="24"/>
-          <w:szCs w:val="24"/>
-        </w:rPr>
-        <w:t>:</w:t>
-      </w:r>
-    </w:p>
-    <w:p>
-      <w:pPr>
-        <w:spacing w:line="360" w:lineRule="auto"/>
-        <w:ind w:firstLineChars="200" w:firstLine="480"/>
-        <w:rPr>
-          <w:sz w:val="24"/>
-          <w:szCs w:val="24"/>
-        </w:rPr>
-      </w:pPr>
-      <w:r>
-        <w:rPr>
-          <w:rFonts w:hint="eastAsia"/>
-          <w:sz w:val="24"/>
-          <w:szCs w:val="24"/>
-        </w:rPr>
-        <w:t>如双方需要，可在合同期满前</w:t>
-      </w:r>
-      <w:r>
-        <w:rPr>
-          <w:rFonts w:hint="eastAsia"/>
-          <w:sz w:val="24"/>
-          <w:szCs w:val="24"/>
-          <w:u w:val="single"/>
-        </w:rPr>
-        <w:t xml:space="preserve">      </w:t>
-      </w:r>
-      <w:proofErr w:type="gramStart"/>
-      <w:r>
-        <w:rPr>
-          <w:rFonts w:hint="eastAsia"/>
-          <w:sz w:val="24"/>
-          <w:szCs w:val="24"/>
-        </w:rPr>
-        <w:t>个</w:t>
-      </w:r>
-      <w:proofErr w:type="gramEnd"/>
-      <w:r>
-        <w:rPr>
-          <w:rFonts w:hint="eastAsia"/>
-          <w:sz w:val="24"/>
-          <w:szCs w:val="24"/>
-        </w:rPr>
-        <w:t>月协商续签劳务雇佣合同。如合同期已满</w:t>
-      </w:r>
-      <w:r>
-        <w:rPr>
-          <w:rFonts w:hint="eastAsia"/>
-          <w:sz w:val="24"/>
-          <w:szCs w:val="24"/>
-        </w:rPr>
-        <w:t>，</w:t>
-      </w:r>
-      <w:r>
-        <w:rPr>
-          <w:rFonts w:hint="eastAsia"/>
-          <w:sz w:val="24"/>
-          <w:szCs w:val="24"/>
-        </w:rPr>
-        <w:t>双方不在续签合同，但乙方从事的有关工作尚未结束，则合同应顺延至有关业务结束</w:t>
-      </w:r>
-    </w:p>
-    <w:p>
-      <w:pPr>
-        <w:spacing w:line="360" w:lineRule="auto"/>
-        <w:ind w:firstLineChars="200" w:firstLine="482"/>
-        <w:rPr>
-          <w:b/>
-          <w:sz w:val="24"/>
-          <w:szCs w:val="24"/>
-        </w:rPr>
-      </w:pPr>
-      <w:r>
-        <w:rPr>
-          <w:rFonts w:hint="eastAsia"/>
-          <w:b/>
-          <w:sz w:val="24"/>
-          <w:szCs w:val="24"/>
-        </w:rPr>
-        <w:t>二、劳务内容</w:t>
-      </w:r>
-    </w:p>
-    <w:p>
-      <w:pPr>
-        <w:spacing w:line="360" w:lineRule="auto"/>
-        <w:ind w:firstLineChars="200" w:firstLine="480"/>
-        <w:rPr>
-          <w:sz w:val="24"/>
-          <w:szCs w:val="24"/>
-          <w:u w:val="single"/>
-        </w:rPr>
-      </w:pPr>
-      <w:r>
-        <w:rPr>
-          <w:rFonts w:hint="eastAsia"/>
-          <w:sz w:val="24"/>
-          <w:szCs w:val="24"/>
-        </w:rPr>
-        <w:t>乙方承担的劳务内容为</w:t>
-      </w:r>
-      <w:r>
-        <w:rPr>
-          <w:rFonts w:hint="eastAsia"/>
-          <w:sz w:val="24"/>
-          <w:szCs w:val="24"/>
-        </w:rPr>
-        <w:t>:</w:t>
-      </w:r>
-      <w:r>
-        <w:rPr>
-          <w:rFonts w:hint="eastAsia"/>
-          <w:sz w:val="24"/>
-          <w:szCs w:val="24"/>
-          <w:u w:val="single"/>
-        </w:rPr>
-        <w:t xml:space="preserve">                                             </w:t>
+        <w:t>乙方承担的劳务内容为: {{job_position}}项目作业施工。</w:t>
       </w:r>
     </w:p>
     <w:p>
@@ -1524,70 +823,7 @@
         </w:rPr>
       </w:pPr>
       <w:r>
-        <w:rPr>
-          <w:rFonts w:hint="eastAsia"/>
-          <w:sz w:val="24"/>
-          <w:szCs w:val="24"/>
-        </w:rPr>
-        <w:t>2</w:t>
-      </w:r>
-      <w:r>
-        <w:rPr>
-          <w:rFonts w:hint="eastAsia"/>
-          <w:sz w:val="24"/>
-          <w:szCs w:val="24"/>
-        </w:rPr>
-        <w:t>、甲乙双方约定，乙方的劳动报酬为</w:t>
-      </w:r>
-      <w:r>
-        <w:rPr>
-          <w:rFonts w:hint="eastAsia"/>
-          <w:sz w:val="24"/>
-          <w:szCs w:val="24"/>
-        </w:rPr>
-        <w:t xml:space="preserve">: </w:t>
-      </w:r>
-      <w:r>
-        <w:rPr>
-          <w:rFonts w:hint="eastAsia"/>
-          <w:sz w:val="24"/>
-          <w:szCs w:val="24"/>
-        </w:rPr>
-        <w:t>每月</w:t>
-      </w:r>
-      <w:r>
-        <w:rPr>
-          <w:rFonts w:hint="eastAsia"/>
-          <w:sz w:val="24"/>
-          <w:szCs w:val="24"/>
-          <w:u w:val="single"/>
-        </w:rPr>
-        <w:t xml:space="preserve">       </w:t>
-      </w:r>
-      <w:r>
-        <w:rPr>
-          <w:rFonts w:hint="eastAsia"/>
-          <w:sz w:val="24"/>
-          <w:szCs w:val="24"/>
-        </w:rPr>
-        <w:t>元，劳务报酬发放日期为每月的</w:t>
-      </w:r>
-      <w:r>
-        <w:rPr>
-          <w:rFonts w:hint="eastAsia"/>
-          <w:sz w:val="24"/>
-          <w:szCs w:val="24"/>
-          <w:u w:val="single"/>
-        </w:rPr>
-        <w:t xml:space="preserve">       </w:t>
-      </w:r>
-      <w:r>
-        <w:rPr>
-          <w:rFonts w:hint="eastAsia"/>
-          <w:sz w:val="24"/>
-          <w:szCs w:val="24"/>
-        </w:rPr>
-        <w:t>日，如遇发放日为节假日，甲方将顺延到最接近的一个工作日发放。</w:t>
+        <w:t>2、甲乙双方约定，乙方的劳动报酬为: 每月 {{salary}} 元，劳务报酬发放日期为每月的 {{salary_payment_date}} 日，如遇发放日为节假日，甲方将顺延到最接近的一个工作日发放。</w:t>
       </w:r>
     </w:p>
     <w:p>
@@ -2425,146 +1661,7 @@
         </w:rPr>
       </w:pPr>
       <w:r>
-        <w:rPr>
-          <w:rFonts w:hint="eastAsia"/>
-          <w:sz w:val="24"/>
-          <w:szCs w:val="24"/>
-        </w:rPr>
-        <w:t>签订日期</w:t>
-      </w:r>
-      <w:r>
-        <w:rPr>
-          <w:rFonts w:hint="eastAsia"/>
-          <w:sz w:val="24"/>
-          <w:szCs w:val="24"/>
-        </w:rPr>
-        <w:t>:</w:t>
-      </w:r>
-      <w:r>
-        <w:rPr>
-          <w:rFonts w:hint="eastAsia"/>
-          <w:sz w:val="24"/>
-          <w:szCs w:val="24"/>
-          <w:u w:val="single"/>
-        </w:rPr>
-        <w:t xml:space="preserve">     </w:t>
-      </w:r>
-      <w:r>
-        <w:rPr>
-          <w:rFonts w:hint="eastAsia"/>
-          <w:sz w:val="24"/>
-          <w:szCs w:val="24"/>
-        </w:rPr>
-        <w:t>年</w:t>
-      </w:r>
-      <w:r>
-        <w:rPr>
-          <w:rFonts w:hint="eastAsia"/>
-          <w:sz w:val="24"/>
-          <w:szCs w:val="24"/>
-          <w:u w:val="single"/>
-        </w:rPr>
-        <w:t xml:space="preserve">     </w:t>
-      </w:r>
-      <w:r>
-        <w:rPr>
-          <w:rFonts w:hint="eastAsia"/>
-          <w:sz w:val="24"/>
-          <w:szCs w:val="24"/>
-        </w:rPr>
-        <w:t>月</w:t>
-      </w:r>
-      <w:r>
-        <w:rPr>
-          <w:rFonts w:hint="eastAsia"/>
-          <w:sz w:val="24"/>
-          <w:szCs w:val="24"/>
-          <w:u w:val="single"/>
-        </w:rPr>
-        <w:t xml:space="preserve">     </w:t>
-      </w:r>
-      <w:r>
-        <w:rPr>
-          <w:rFonts w:hint="eastAsia"/>
-          <w:sz w:val="24"/>
-          <w:szCs w:val="24"/>
-        </w:rPr>
-        <w:t>日</w:t>
-      </w:r>
-      <w:r>
-        <w:rPr>
-          <w:rFonts w:hint="eastAsia"/>
-          <w:sz w:val="24"/>
-          <w:szCs w:val="24"/>
-        </w:rPr>
-        <w:t xml:space="preserve">  </w:t>
-      </w:r>
-      <w:r>
-        <w:rPr>
-          <w:rFonts w:hint="eastAsia"/>
-          <w:sz w:val="24"/>
-          <w:szCs w:val="24"/>
-        </w:rPr>
-        <w:t>签订日期</w:t>
-      </w:r>
-      <w:r>
-        <w:rPr>
-          <w:rFonts w:hint="eastAsia"/>
-          <w:sz w:val="24"/>
-          <w:szCs w:val="24"/>
-        </w:rPr>
-        <w:t>:</w:t>
-      </w:r>
-      <w:r>
-        <w:rPr>
-          <w:rFonts w:hint="eastAsia"/>
-          <w:sz w:val="24"/>
-          <w:szCs w:val="24"/>
-          <w:u w:val="single"/>
-        </w:rPr>
-        <w:t xml:space="preserve">     </w:t>
-      </w:r>
-      <w:r>
-        <w:rPr>
-          <w:rFonts w:hint="eastAsia"/>
-          <w:sz w:val="24"/>
-          <w:szCs w:val="24"/>
-        </w:rPr>
-        <w:t>年</w:t>
-      </w:r>
-      <w:r>
-        <w:rPr>
-          <w:rFonts w:hint="eastAsia"/>
-          <w:sz w:val="24"/>
-          <w:szCs w:val="24"/>
-          <w:u w:val="single"/>
-        </w:rPr>
-        <w:t xml:space="preserve">     </w:t>
-      </w:r>
-      <w:r>
-        <w:rPr>
-          <w:rFonts w:hint="eastAsia"/>
-          <w:sz w:val="24"/>
-          <w:szCs w:val="24"/>
-        </w:rPr>
-        <w:t>月</w:t>
-      </w:r>
-      <w:r>
-        <w:rPr>
-          <w:rFonts w:hint="eastAsia"/>
-          <w:sz w:val="24"/>
-          <w:szCs w:val="24"/>
-          <w:u w:val="single"/>
-        </w:rPr>
-        <w:t xml:space="preserve">     </w:t>
-      </w:r>
-      <w:r>
-        <w:rPr>
-          <w:rFonts w:hint="eastAsia"/>
-          <w:sz w:val="24"/>
-          <w:szCs w:val="24"/>
-        </w:rPr>
-        <w:t>日</w:t>
+        <w:t>签订日期: {{signing_date}}  签订日期: {{signing_date}}</w:t>
       </w:r>
     </w:p>
     <w:p>
@@ -3030,146 +2127,7 @@
         </w:rPr>
       </w:pPr>
       <w:r>
-        <w:rPr>
-          <w:rFonts w:hint="eastAsia"/>
-          <w:sz w:val="24"/>
-          <w:szCs w:val="24"/>
-        </w:rPr>
-        <w:t>签订日期</w:t>
-      </w:r>
-      <w:r>
-        <w:rPr>
-          <w:rFonts w:hint="eastAsia"/>
-          <w:sz w:val="24"/>
-          <w:szCs w:val="24"/>
-        </w:rPr>
-        <w:t>:</w:t>
-      </w:r>
-      <w:r>
-        <w:rPr>
-          <w:rFonts w:hint="eastAsia"/>
-          <w:sz w:val="24"/>
-          <w:szCs w:val="24"/>
-          <w:u w:val="single"/>
-        </w:rPr>
-        <w:t xml:space="preserve">     </w:t>
-      </w:r>
-      <w:r>
-        <w:rPr>
-          <w:rFonts w:hint="eastAsia"/>
-          <w:sz w:val="24"/>
-          <w:szCs w:val="24"/>
-        </w:rPr>
-        <w:t>年</w:t>
-      </w:r>
-      <w:r>
-        <w:rPr>
-          <w:rFonts w:hint="eastAsia"/>
-          <w:sz w:val="24"/>
-          <w:szCs w:val="24"/>
-          <w:u w:val="single"/>
-        </w:rPr>
-        <w:t xml:space="preserve">     </w:t>
-      </w:r>
-      <w:r>
-        <w:rPr>
-          <w:rFonts w:hint="eastAsia"/>
-          <w:sz w:val="24"/>
-          <w:szCs w:val="24"/>
-        </w:rPr>
-        <w:t>月</w:t>
-      </w:r>
-      <w:r>
-        <w:rPr>
-          <w:rFonts w:hint="eastAsia"/>
-          <w:sz w:val="24"/>
-          <w:szCs w:val="24"/>
-          <w:u w:val="single"/>
-        </w:rPr>
-        <w:t xml:space="preserve">    </w:t>
-      </w:r>
-      <w:r>
-        <w:rPr>
-          <w:rFonts w:hint="eastAsia"/>
-          <w:sz w:val="24"/>
-          <w:szCs w:val="24"/>
-        </w:rPr>
-        <w:t>日</w:t>
-      </w:r>
-      <w:r>
-        <w:rPr>
-          <w:rFonts w:hint="eastAsia"/>
-          <w:sz w:val="24"/>
-          <w:szCs w:val="24"/>
-        </w:rPr>
-        <w:t xml:space="preserve">  </w:t>
-      </w:r>
-      <w:r>
-        <w:rPr>
-          <w:rFonts w:hint="eastAsia"/>
-          <w:sz w:val="24"/>
-          <w:szCs w:val="24"/>
-        </w:rPr>
-        <w:t>签订日期</w:t>
-      </w:r>
-      <w:r>
-        <w:rPr>
-          <w:rFonts w:hint="eastAsia"/>
-          <w:sz w:val="24"/>
-          <w:szCs w:val="24"/>
-        </w:rPr>
-        <w:t>:</w:t>
-      </w:r>
-      <w:r>
-        <w:rPr>
-          <w:rFonts w:hint="eastAsia"/>
-          <w:sz w:val="24"/>
-          <w:szCs w:val="24"/>
-          <w:u w:val="single"/>
-        </w:rPr>
-        <w:t xml:space="preserve">     </w:t>
-      </w:r>
-      <w:r>
-        <w:rPr>
-          <w:rFonts w:hint="eastAsia"/>
-          <w:sz w:val="24"/>
-          <w:szCs w:val="24"/>
-        </w:rPr>
-        <w:t>年</w:t>
-      </w:r>
-      <w:r>
-        <w:rPr>
-          <w:rFonts w:hint="eastAsia"/>
-          <w:sz w:val="24"/>
-          <w:szCs w:val="24"/>
-          <w:u w:val="single"/>
-        </w:rPr>
-        <w:t xml:space="preserve">     </w:t>
-      </w:r>
-      <w:r>
-        <w:rPr>
-          <w:rFonts w:hint="eastAsia"/>
-          <w:sz w:val="24"/>
-          <w:szCs w:val="24"/>
-        </w:rPr>
-        <w:t>月</w:t>
-      </w:r>
-      <w:r>
-        <w:rPr>
-          <w:rFonts w:hint="eastAsia"/>
-          <w:sz w:val="24"/>
-          <w:szCs w:val="24"/>
-          <w:u w:val="single"/>
-        </w:rPr>
-        <w:t xml:space="preserve">     </w:t>
-      </w:r>
-      <w:r>
-        <w:rPr>
-          <w:rFonts w:hint="eastAsia"/>
-          <w:sz w:val="24"/>
-          <w:szCs w:val="24"/>
-        </w:rPr>
-        <w:t>日</w:t>
+        <w:t>签订日期: {{signing_date}}  签订日期: {{signing_date}}</w:t>
       </w:r>
     </w:p>
     <w:p>

</xml_diff>